<commit_message>
Publish carrier v0.2-r1 corrections and third Astra final review
</commit_message>
<xml_diff>
--- a/submission/carrier_coupling_v0_2/WRRA_Carrier_Coupling_v0_2_EN.docx
+++ b/submission/carrier_coupling_v0_2/WRRA_Carrier_Coupling_v0_2_EN.docx
@@ -15148,10 +15148,10 @@
         </m:r>
         <m:sSub>
           <m:e>
-            <m:acc>
-              <m:accPr>
-                <m:chr m:val="‾"/>
-              </m:accPr>
+            <m:bar>
+              <m:barPr>
+                <m:pos m:val="top"/>
+              </m:barPr>
               <m:e>
                 <m:r>
                   <w:rPr>
@@ -15160,7 +15160,7 @@
                   <m:t>ν</m:t>
                 </m:r>
               </m:e>
-            </m:acc>
+            </m:bar>
           </m:e>
           <m:sub>
             <m:r>
@@ -19979,7 +19979,7 @@
                 <w:b w:val="0"/>
                 <w:sz w:val="20"/>
               </w:rPr>
-              <w:t xml:space="preserve">Hot electron branch has positive derivative</w:t>
+              <w:t>Hot electron branch has a positive pressure-volume moment</w:t>
             </w:r>
           </w:p>
         </w:tc>

</xml_diff>